<commit_message>
Add photo gallery, drop Lessons 11-12
- Add a Photos/ gallery: stills of the built arm and prototypes, CAD
  renders, the exploded view, and the YOLOv8 detection screenshot
- Add a Gallery section to the main README and the Desmos screenshot to
  the Lesson 3 README
- Remove Lessons 11 and 12 (and the capstone challenge) from both READMEs
  and the course overview; the course is now 10 lessons

Co-Authored-By: Claude Opus 5.5 <noreply@anthropic.com>
Claude-Session: https://claude.ai/code/session_01PhX7iZ5z4ge4VQYuYbMAnE
</commit_message>
<xml_diff>
--- a/Curriculum/Robotic Arm Lessons Overview.docx
+++ b/Curriculum/Robotic Arm Lessons Overview.docx
@@ -63,7 +63,7 @@
         <w:rPr>
           <w:rtl w:val="0"/>
         </w:rPr>
-        <w:t xml:space="preserve">This course introduces high school students to the mechanical, mathematical, and computational principles behind a 4-DOF robotic arm. Students begin by physically building and understanding the arm, then progress through forward kinematics (FK), inverse kinematics (IK), and computer vision, culminating in a final challenge where students integrate everything they've learned to make the arm autonomously detect, locate, and move to an object.</w:t>
+        <w:t xml:space="preserve">This course introduces high school students to the mechanical, mathematical, and computational principles behind a 4-DOF robotic arm. Students begin by physically building and understanding the arm, then progress through forward kinematics (FK), inverse kinematics (IK), and computer vision.</w:t>
       </w:r>
     </w:p>
     <w:p>
@@ -193,18 +193,13 @@
           <w:bCs w:val="1"/>
           <w:rtl w:val="0"/>
         </w:rPr>
-        <w:t xml:space="preserve">12 lessons</w:t>
+        <w:t xml:space="preserve">10 lessons</w:t>
       </w:r>
       <w:r>
         <w:rPr>
           <w:rtl w:val="0"/>
         </w:rPr>
         <w:t xml:space="preserve">.</w:t>
-      </w:r>
-      <w:r>
-        <w:rPr>
-          <w:rtl w:val="0"/>
-        </w:rPr>
       </w:r>
     </w:p>
     <w:tbl>
@@ -1209,19 +1204,7 @@
               <w:rPr>
                 <w:rtl w:val="0"/>
               </w:rPr>
-              <w:t xml:space="preserve">Coding </w:t>
-            </w:r>
-            <w:r>
-              <w:rPr>
-                <w:rtl w:val="0"/>
-              </w:rPr>
-              <w:t xml:space="preserve">IK and</w:t>
-            </w:r>
-            <w:r>
-              <w:rPr>
-                <w:rtl w:val="0"/>
-              </w:rPr>
-              <w:t xml:space="preserve"> a short overview of Jacobins as a preview of advanced methods</w:t>
+              <w:t xml:space="preserve">Coding IK and a short overview of Jacobins as a preview of advanced methods</w:t>
             </w:r>
           </w:p>
         </w:tc>
@@ -1466,246 +1449,6 @@
           </w:p>
         </w:tc>
       </w:tr>
-      <w:tr>
-        <w:trPr>
-          <w:cantSplit w:val="0"/>
-          <w:tblHeader w:val="0"/>
-        </w:trPr>
-        <w:tc>
-          <w:tcPr>
-            <w:shd w:fill="auto" w:val="clear"/>
-            <w:tcMar>
-              <w:top w:w="100.0" w:type="dxa"/>
-              <w:left w:w="100.0" w:type="dxa"/>
-              <w:bottom w:w="100.0" w:type="dxa"/>
-              <w:right w:w="100.0" w:type="dxa"/>
-            </w:tcMar>
-            <w:vAlign w:val="top"/>
-          </w:tcPr>
-          <w:p>
-            <w:pPr>
-              <w:keepNext w:val="0"/>
-              <w:keepLines w:val="0"/>
-              <w:pageBreakBefore w:val="0"/>
-              <w:widowControl w:val="0"/>
-              <w:pBdr>
-                <w:top w:space="0" w:sz="0" w:val="nil"/>
-                <w:left w:space="0" w:sz="0" w:val="nil"/>
-                <w:bottom w:space="0" w:sz="0" w:val="nil"/>
-                <w:right w:space="0" w:sz="0" w:val="nil"/>
-                <w:between w:space="0" w:sz="0" w:val="nil"/>
-              </w:pBdr>
-              <w:shd w:fill="auto" w:val="clear"/>
-              <w:spacing w:after="0" w:before="0" w:line="240" w:lineRule="auto"/>
-              <w:ind w:left="0" w:right="0" w:firstLine="0"/>
-              <w:jc w:val="left"/>
-              <w:rPr/>
-            </w:pPr>
-            <w:r>
-              <w:rPr>
-                <w:rtl w:val="0"/>
-              </w:rPr>
-              <w:t xml:space="preserve">11</w:t>
-            </w:r>
-          </w:p>
-        </w:tc>
-        <w:tc>
-          <w:tcPr>
-            <w:shd w:fill="auto" w:val="clear"/>
-            <w:tcMar>
-              <w:top w:w="100.0" w:type="dxa"/>
-              <w:left w:w="100.0" w:type="dxa"/>
-              <w:bottom w:w="100.0" w:type="dxa"/>
-              <w:right w:w="100.0" w:type="dxa"/>
-            </w:tcMar>
-            <w:vAlign w:val="top"/>
-          </w:tcPr>
-          <w:p>
-            <w:pPr>
-              <w:keepNext w:val="0"/>
-              <w:keepLines w:val="0"/>
-              <w:pageBreakBefore w:val="0"/>
-              <w:widowControl w:val="0"/>
-              <w:pBdr>
-                <w:top w:space="0" w:sz="0" w:val="nil"/>
-                <w:left w:space="0" w:sz="0" w:val="nil"/>
-                <w:bottom w:space="0" w:sz="0" w:val="nil"/>
-                <w:right w:space="0" w:sz="0" w:val="nil"/>
-                <w:between w:space="0" w:sz="0" w:val="nil"/>
-              </w:pBdr>
-              <w:shd w:fill="auto" w:val="clear"/>
-              <w:spacing w:after="0" w:before="0" w:line="240" w:lineRule="auto"/>
-              <w:ind w:left="0" w:right="0" w:firstLine="0"/>
-              <w:jc w:val="left"/>
-              <w:rPr/>
-            </w:pPr>
-            <w:r>
-              <w:rPr>
-                <w:rtl w:val="0"/>
-              </w:rPr>
-              <w:t xml:space="preserve">Stereoscopic Vision &amp; AI Object Detection</w:t>
-            </w:r>
-          </w:p>
-        </w:tc>
-        <w:tc>
-          <w:tcPr>
-            <w:shd w:fill="auto" w:val="clear"/>
-            <w:tcMar>
-              <w:top w:w="100.0" w:type="dxa"/>
-              <w:left w:w="100.0" w:type="dxa"/>
-              <w:bottom w:w="100.0" w:type="dxa"/>
-              <w:right w:w="100.0" w:type="dxa"/>
-            </w:tcMar>
-            <w:vAlign w:val="top"/>
-          </w:tcPr>
-          <w:p>
-            <w:pPr>
-              <w:keepNext w:val="0"/>
-              <w:keepLines w:val="0"/>
-              <w:pageBreakBefore w:val="0"/>
-              <w:widowControl w:val="0"/>
-              <w:pBdr>
-                <w:top w:space="0" w:sz="0" w:val="nil"/>
-                <w:left w:space="0" w:sz="0" w:val="nil"/>
-                <w:bottom w:space="0" w:sz="0" w:val="nil"/>
-                <w:right w:space="0" w:sz="0" w:val="nil"/>
-                <w:between w:space="0" w:sz="0" w:val="nil"/>
-              </w:pBdr>
-              <w:shd w:fill="auto" w:val="clear"/>
-              <w:spacing w:after="0" w:before="0" w:line="240" w:lineRule="auto"/>
-              <w:ind w:left="0" w:right="0" w:firstLine="0"/>
-              <w:jc w:val="left"/>
-              <w:rPr/>
-            </w:pPr>
-            <w:r>
-              <w:rPr>
-                <w:rtl w:val="0"/>
-              </w:rPr>
-              <w:t xml:space="preserve">Combining detection and depth to locate objects in 3D </w:t>
-            </w:r>
-          </w:p>
-        </w:tc>
-      </w:tr>
-      <w:tr>
-        <w:trPr>
-          <w:cantSplit w:val="0"/>
-          <w:tblHeader w:val="0"/>
-        </w:trPr>
-        <w:tc>
-          <w:tcPr>
-            <w:shd w:fill="auto" w:val="clear"/>
-            <w:tcMar>
-              <w:top w:w="100.0" w:type="dxa"/>
-              <w:left w:w="100.0" w:type="dxa"/>
-              <w:bottom w:w="100.0" w:type="dxa"/>
-              <w:right w:w="100.0" w:type="dxa"/>
-            </w:tcMar>
-            <w:vAlign w:val="top"/>
-          </w:tcPr>
-          <w:p>
-            <w:pPr>
-              <w:keepNext w:val="0"/>
-              <w:keepLines w:val="0"/>
-              <w:pageBreakBefore w:val="0"/>
-              <w:widowControl w:val="0"/>
-              <w:pBdr>
-                <w:top w:space="0" w:sz="0" w:val="nil"/>
-                <w:left w:space="0" w:sz="0" w:val="nil"/>
-                <w:bottom w:space="0" w:sz="0" w:val="nil"/>
-                <w:right w:space="0" w:sz="0" w:val="nil"/>
-                <w:between w:space="0" w:sz="0" w:val="nil"/>
-              </w:pBdr>
-              <w:shd w:fill="auto" w:val="clear"/>
-              <w:spacing w:after="0" w:before="0" w:line="240" w:lineRule="auto"/>
-              <w:ind w:left="0" w:right="0" w:firstLine="0"/>
-              <w:jc w:val="left"/>
-              <w:rPr/>
-            </w:pPr>
-            <w:r>
-              <w:rPr>
-                <w:rtl w:val="0"/>
-              </w:rPr>
-              <w:t xml:space="preserve">12</w:t>
-            </w:r>
-          </w:p>
-        </w:tc>
-        <w:tc>
-          <w:tcPr>
-            <w:shd w:fill="auto" w:val="clear"/>
-            <w:tcMar>
-              <w:top w:w="100.0" w:type="dxa"/>
-              <w:left w:w="100.0" w:type="dxa"/>
-              <w:bottom w:w="100.0" w:type="dxa"/>
-              <w:right w:w="100.0" w:type="dxa"/>
-            </w:tcMar>
-            <w:vAlign w:val="top"/>
-          </w:tcPr>
-          <w:p>
-            <w:pPr>
-              <w:keepNext w:val="0"/>
-              <w:keepLines w:val="0"/>
-              <w:pageBreakBefore w:val="0"/>
-              <w:widowControl w:val="0"/>
-              <w:pBdr>
-                <w:top w:space="0" w:sz="0" w:val="nil"/>
-                <w:left w:space="0" w:sz="0" w:val="nil"/>
-                <w:bottom w:space="0" w:sz="0" w:val="nil"/>
-                <w:right w:space="0" w:sz="0" w:val="nil"/>
-                <w:between w:space="0" w:sz="0" w:val="nil"/>
-              </w:pBdr>
-              <w:shd w:fill="auto" w:val="clear"/>
-              <w:spacing w:after="0" w:before="0" w:line="240" w:lineRule="auto"/>
-              <w:ind w:left="0" w:right="0" w:firstLine="0"/>
-              <w:jc w:val="left"/>
-              <w:rPr/>
-            </w:pPr>
-            <w:r>
-              <w:rPr>
-                <w:rtl w:val="0"/>
-              </w:rPr>
-              <w:t xml:space="preserve">Challenge: Move Object</w:t>
-            </w:r>
-          </w:p>
-        </w:tc>
-        <w:tc>
-          <w:tcPr>
-            <w:shd w:fill="auto" w:val="clear"/>
-            <w:tcMar>
-              <w:top w:w="100.0" w:type="dxa"/>
-              <w:left w:w="100.0" w:type="dxa"/>
-              <w:bottom w:w="100.0" w:type="dxa"/>
-              <w:right w:w="100.0" w:type="dxa"/>
-            </w:tcMar>
-            <w:vAlign w:val="top"/>
-          </w:tcPr>
-          <w:p>
-            <w:pPr>
-              <w:keepNext w:val="0"/>
-              <w:keepLines w:val="0"/>
-              <w:pageBreakBefore w:val="0"/>
-              <w:widowControl w:val="0"/>
-              <w:pBdr>
-                <w:top w:space="0" w:sz="0" w:val="nil"/>
-                <w:left w:space="0" w:sz="0" w:val="nil"/>
-                <w:bottom w:space="0" w:sz="0" w:val="nil"/>
-                <w:right w:space="0" w:sz="0" w:val="nil"/>
-                <w:between w:space="0" w:sz="0" w:val="nil"/>
-              </w:pBdr>
-              <w:shd w:fill="auto" w:val="clear"/>
-              <w:spacing w:after="0" w:before="0" w:line="240" w:lineRule="auto"/>
-              <w:ind w:left="0" w:right="0" w:firstLine="0"/>
-              <w:jc w:val="left"/>
-              <w:rPr/>
-            </w:pPr>
-            <w:r>
-              <w:rPr>
-                <w:rtl w:val="0"/>
-              </w:rPr>
-              <w:t xml:space="preserve">Full pipeline integration; autonomous pick/place demo </w:t>
-            </w:r>
-          </w:p>
-        </w:tc>
-      </w:tr>
     </w:tbl>
     <w:p>
       <w:pPr>
@@ -1825,22 +1568,6 @@
           <w:ilvl w:val="0"/>
           <w:numId w:val="7"/>
         </w:numPr>
-        <w:spacing w:after="0" w:afterAutospacing="0" w:before="0" w:beforeAutospacing="0" w:lineRule="auto"/>
-        <w:ind w:left="720" w:hanging="360"/>
-      </w:pPr>
-      <w:r>
-        <w:rPr>
-          <w:rtl w:val="0"/>
-        </w:rPr>
-        <w:t xml:space="preserve">Integrate perception, kinematics, and motion control into a single autonomous system</w:t>
-      </w:r>
-    </w:p>
-    <w:p>
-      <w:pPr>
-        <w:numPr>
-          <w:ilvl w:val="0"/>
-          <w:numId w:val="7"/>
-        </w:numPr>
         <w:spacing w:after="240" w:before="0" w:beforeAutospacing="0" w:lineRule="auto"/>
         <w:ind w:left="720" w:hanging="360"/>
       </w:pPr>
@@ -1942,11 +1669,6 @@
           <w:rtl w:val="0"/>
         </w:rPr>
         <w:t xml:space="preserve">This course is primarily an applied engineering/math/CS course. NGSS connections are grouped below by strength Core connections apply clearly across most lessons.</w:t>
-      </w:r>
-      <w:r>
-        <w:rPr>
-          <w:rtl w:val="0"/>
-        </w:rPr>
       </w:r>
     </w:p>
     <w:p>
@@ -2149,7 +1871,7 @@
         <w:rPr>
           <w:rtl w:val="0"/>
         </w:rPr>
-        <w:t xml:space="preserve"> — recognizing recurring angle/position relationships in FK/IK (Lessons 3–8) and recurring visual patterns in object detection (Lessons 9–11)</w:t>
+        <w:t xml:space="preserve"> — recognizing recurring angle/position relationships in FK/IK (Lessons 3–8) and recurring visual patterns in object detection (Lessons 9–10)</w:t>
       </w:r>
     </w:p>
     <w:p>
@@ -2238,7 +1960,7 @@
         <w:rPr>
           <w:rtl w:val="0"/>
         </w:rPr>
-        <w:t xml:space="preserve"> — especially prominent in the coding and integration lessons</w:t>
+        <w:t xml:space="preserve"> — especially prominent in the coding lessons</w:t>
       </w:r>
     </w:p>
     <w:p>
@@ -2519,7 +2241,7 @@
         <w:rPr>
           <w:rtl w:val="0"/>
         </w:rPr>
-        <w:t xml:space="preserve">Target objects for practice and the final challenge</w:t>
+        <w:t xml:space="preserve">Target objects for practice</w:t>
       </w:r>
     </w:p>
     <w:p>
@@ -2557,7 +2279,7 @@
         <w:rPr>
           <w:rtl w:val="0"/>
         </w:rPr>
-        <w:t xml:space="preserve">Each lesson includes a short formative assessment (multiple choice, short answer, or exit ticket) tied directly to that lesson's objectives. Lessons involving code (5, 8, 11) are assessed primarily through working implementations validated against known test cases. The course culminates in a performance-based summative assessment: Lesson 12's live challenge, where teams demonstrate an arm autonomously detecting and moving to a target object.</w:t>
+        <w:t xml:space="preserve">Each lesson includes a short formative assessment (multiple choice, short answer, or exit ticket) tied directly to that lesson's objectives. Lessons involving code (5 and 8) are assessed primarily through working implementations validated against known test cases.</w:t>
       </w:r>
     </w:p>
     <w:p>
@@ -2685,38 +2407,14 @@
           <w:bCs w:val="1"/>
           <w:rtl w:val="0"/>
         </w:rPr>
-        <w:t xml:space="preserve">Lessons 9–11</w:t>
+        <w:t xml:space="preserve">Lessons 9–10</w:t>
       </w:r>
       <w:r>
         <w:rPr>
           <w:rFonts w:ascii="Arial Unicode MS" w:cs="Arial Unicode MS" w:eastAsia="Arial Unicode MS" w:hAnsi="Arial Unicode MS"/>
           <w:rtl w:val="0"/>
         </w:rPr>
-        <w:t xml:space="preserve"> build the perception pipeline in isolated pieces (camera → detection → combined) before anything is connected to the arm</w:t>
-      </w:r>
-    </w:p>
-    <w:p>
-      <w:pPr>
-        <w:numPr>
-          <w:ilvl w:val="0"/>
-          <w:numId w:val="1"/>
-        </w:numPr>
-        <w:spacing w:after="240" w:before="0" w:beforeAutospacing="0" w:lineRule="auto"/>
-        <w:ind w:left="720" w:hanging="360"/>
-      </w:pPr>
-      <w:r>
-        <w:rPr>
-          <w:b w:val="1"/>
-          <w:bCs w:val="1"/>
-          <w:rtl w:val="0"/>
-        </w:rPr>
-        <w:t xml:space="preserve">Lesson 12</w:t>
-      </w:r>
-      <w:r>
-        <w:rPr>
-          <w:rtl w:val="0"/>
-        </w:rPr>
-        <w:t xml:space="preserve"> is the only lesson requiring every prior lesson's output to work together, serving as the course's capstone</w:t>
+        <w:t xml:space="preserve"> build the perception pipeline in two pieces (camera → detection)</w:t>
       </w:r>
     </w:p>
     <w:p>

</xml_diff>

<commit_message>
Update the Lesson 4 and 5 course descriptions
Describe Lesson 4 as forward kinematics with vectors and the DH angle
convention (no matrices) and Lesson 5 as coding forward kinematics one
function at a time, in both the Curriculum README and the course
overview document.

Co-Authored-By: Claude Opus 5.5 <noreply@anthropic.com>
Claude-Session: https://claude.ai/code/session_01MLFYEPar84CHHqK75rMbXG
</commit_message>
<xml_diff>
--- a/Curriculum/Robotic Arm Lessons Overview.docx
+++ b/Curriculum/Robotic Arm Lessons Overview.docx
@@ -782,7 +782,7 @@
               <w:rPr>
                 <w:rtl w:val="0"/>
               </w:rPr>
-              <w:t xml:space="preserve">An introduction to FK using DH parameters and matrices </w:t>
+              <w:t xml:space="preserve">Forward kinematics with vectors: measure joint angles the DH way, write each link as a unit vector, turn arrows to find the forearm, and add the link vectors to find the tip in 2D and 3D. No matrices. </w:t>
             </w:r>
           </w:p>
         </w:tc>
@@ -888,7 +888,7 @@
               <w:rPr>
                 <w:rtl w:val="0"/>
               </w:rPr>
-              <w:t xml:space="preserve">Coding FK and a short overview of screw theory as a preview of advanced methods </w:t>
+              <w:t xml:space="preserve">Coding forward kinematics in Python one function at a time, checking it against Lesson 3’s method, and mapping the arm’s reach </w:t>
             </w:r>
           </w:p>
         </w:tc>

</xml_diff>

<commit_message>
Add Lessons 9 and 10 and swap their order
Lesson 9 is now AI Object Detection and Lesson 10 is Stereoscopic
Camera, so detection finds the target and stereo adds the distance.

- Lesson 9 and 10 folders: lesson plans (PDF and Word), slides (PDF and
  PowerPoint) and READMEs
- Code: the Lesson 9 detection helper and pipeline script, and the
  Lesson 10 stereo helper, depth check, calibration and target scripts.
  disparity_map now searches up to 160 px, so it sees down to ~263 mm
- Course tables in both READMEs and the Overview docx list the new
  order and link the two lessons

Co-Authored-By: Claude Opus 5.5 <noreply@anthropic.com>
Claude-Session: https://claude.ai/code/session_01MLFYEPar84CHHqK75rMbXG
</commit_message>
<xml_diff>
--- a/Curriculum/Robotic Arm Lessons Overview.docx
+++ b/Curriculum/Robotic Arm Lessons Overview.docx
@@ -1286,7 +1286,7 @@
               <w:rPr>
                 <w:rtl w:val="0"/>
               </w:rPr>
-              <w:t xml:space="preserve">Stereoscopic Camera</w:t>
+              <w:t xml:space="preserve">AI Object Detection</w:t>
             </w:r>
           </w:p>
         </w:tc>
@@ -1324,7 +1324,7 @@
               <w:rPr>
                 <w:rtl w:val="0"/>
               </w:rPr>
-              <w:t xml:space="preserve">Depth perception via disparity, camera calibration </w:t>
+              <w:t xml:space="preserve">Pretrained object detection models, bounding boxes, turning the base toward a target </w:t>
             </w:r>
           </w:p>
         </w:tc>
@@ -1406,7 +1406,7 @@
               <w:rPr>
                 <w:rtl w:val="0"/>
               </w:rPr>
-              <w:t xml:space="preserve">AI Object Detection</w:t>
+              <w:t xml:space="preserve">Stereoscopic Camera</w:t>
             </w:r>
           </w:p>
         </w:tc>
@@ -1444,7 +1444,7 @@
               <w:rPr>
                 <w:rtl w:val="0"/>
               </w:rPr>
-              <w:t xml:space="preserve">Pretrained object detection models, bounding boxes </w:t>
+              <w:t xml:space="preserve">Depth perception via disparity, camera calibration, 3D target points for the arm </w:t>
             </w:r>
           </w:p>
         </w:tc>
@@ -2414,7 +2414,7 @@
           <w:rFonts w:ascii="Arial Unicode MS" w:cs="Arial Unicode MS" w:eastAsia="Arial Unicode MS" w:hAnsi="Arial Unicode MS"/>
           <w:rtl w:val="0"/>
         </w:rPr>
-        <w:t xml:space="preserve"> build the perception pipeline in two pieces (camera → detection)</w:t>
+        <w:t xml:space="preserve"> build the perception pipeline in two pieces (detection → depth)</w:t>
       </w:r>
     </w:p>
     <w:p>

</xml_diff>